<commit_message>
Eksik gorsel kutularina Shutterstock ID'leri ve cizim notlari eklendi (1.2, 1.3, 3.1)
</commit_message>
<xml_diff>
--- a/Kim12-3-1-Boyaya-Duyarli-Gunes-Pilleri.docx
+++ b/Kim12-3-1-Boyaya-Duyarli-Gunes-Pilleri.docx
@@ -555,7 +555,7 @@
                 <w:rFonts w:ascii="Times New Roman" w:hAnsi="Times New Roman" w:cs="Times New Roman"/>
                 <w:lang w:val="tr-TR"/>
               </w:rPr>
-              <w:t xml:space="preserve">Shutter ID: ……………</w:t>
+              <w:t xml:space="preserve">Shutter ID: Boyaya duyarlı güneş hücresi fotoğrafı bulunamadı; atölyede yapılan hücrenin fotoğrafı çekilmeli ya da yayınevi çizmeli.</w:t>
             </w:r>
           </w:p>
         </w:tc>
@@ -1646,7 +1646,7 @@
                 <w:rFonts w:ascii="Times New Roman" w:hAnsi="Times New Roman" w:cs="Times New Roman"/>
                 <w:lang w:val="tr-TR"/>
               </w:rPr>
-              <w:t xml:space="preserve">Shutter ID: ……………</w:t>
+              <w:t xml:space="preserve">Shutter ID: Boyaya duyarlı güneş hücresi cephe/hücre fotoğrafı bulunamadı; atölyede yapılan hücrenin fotoğrafı çekilmeli ya da yayınevi çizmeli.</w:t>
             </w:r>
           </w:p>
         </w:tc>
@@ -1927,7 +1927,7 @@
                 <w:rFonts w:ascii="Times New Roman" w:hAnsi="Times New Roman" w:cs="Times New Roman"/>
                 <w:lang w:val="tr-TR"/>
               </w:rPr>
-              <w:t xml:space="preserve">Shutter ID: ……………</w:t>
+              <w:t xml:space="preserve">Shutter ID: Yok; şema yayınevi tarafından çizilecek.</w:t>
             </w:r>
           </w:p>
         </w:tc>
@@ -7656,7 +7656,7 @@
                 <w:rFonts w:ascii="Times New Roman" w:hAnsi="Times New Roman" w:cs="Times New Roman"/>
                 <w:lang w:val="tr-TR"/>
               </w:rPr>
-              <w:t xml:space="preserve">Shutter ID: ……………</w:t>
+              <w:t xml:space="preserve">Shutter ID: Yok; şema yayınevi tarafından çizilecek.</w:t>
             </w:r>
           </w:p>
         </w:tc>

</xml_diff>

<commit_message>
Kim12-3-1-Boyaya-Duyarli-Gunes-Pilleri: gorsel alanlarina Shutter onizlemeleri yerlestirildi (2.3 bicimi)
</commit_message>
<xml_diff>
--- a/Kim12-3-1-Boyaya-Duyarli-Gunes-Pilleri.docx
+++ b/Kim12-3-1-Boyaya-Duyarli-Gunes-Pilleri.docx
@@ -42,437 +42,385 @@
         <w:t xml:space="preserve">BÖLÜM: Nanobilim, Yeşil Kimya ve Sürdürülebilirlik</w:t>
       </w:r>
     </w:p>
-    <w:tbl>
-      <w:tblPr>
-        <w:tblW w:w="9000" w:type="dxa"/>
+    <w:p>
+      <w:pPr>
         <w:jc w:val="center"/>
-        <w:tblBorders>
-          <w:top w:val="single" w:sz="8" w:space="0" w:color="7F7F7F"/>
-          <w:left w:val="single" w:sz="8" w:space="0" w:color="7F7F7F"/>
-          <w:bottom w:val="single" w:sz="8" w:space="0" w:color="7F7F7F"/>
-          <w:right w:val="single" w:sz="8" w:space="0" w:color="7F7F7F"/>
-        </w:tblBorders>
-      </w:tblPr>
-      <w:tblGrid>
-        <w:gridCol w:w="9000"/>
-      </w:tblGrid>
-      <w:tr>
-        <w:tc>
-          <w:tcPr>
-            <w:tcW w:w="9000" w:type="dxa"/>
-            <w:shd w:val="clear" w:color="auto" w:fill="EDEDED"/>
-          </w:tcPr>
-          <w:p>
-            <w:pPr>
-              <w:jc w:val="both"/>
-              <w:rPr>
-                <w:rFonts w:ascii="Times New Roman" w:hAnsi="Times New Roman" w:cs="Times New Roman"/>
-                <w:lang w:val="tr-TR"/>
-              </w:rPr>
-            </w:pPr>
-            <w:r>
-              <w:rPr>
-                <w:rFonts w:ascii="Times New Roman" w:hAnsi="Times New Roman" w:cs="Times New Roman"/>
-                <w:lang w:val="tr-TR"/>
-              </w:rPr>
-              <w:t xml:space="preserve">GÖRSEL ALANI (Shutterstock)</w:t>
-            </w:r>
-          </w:p>
-          <w:p>
-            <w:pPr>
-              <w:jc w:val="both"/>
-              <w:rPr>
-                <w:rFonts w:ascii="Times New Roman" w:hAnsi="Times New Roman" w:cs="Times New Roman"/>
-                <w:lang w:val="tr-TR"/>
-              </w:rPr>
-            </w:pPr>
-            <w:r>
-              <w:rPr>
-                <w:rFonts w:ascii="Times New Roman" w:hAnsi="Times New Roman" w:cs="Times New Roman"/>
-                <w:lang w:val="tr-TR"/>
-              </w:rPr>
-              <w:t xml:space="preserve">Tarif: Güneş ışığı alan yeşil yapraklar ile ön planda renkli (kırmızı-mor tonlarda), yarı saydam güneş hücresi panelleri bulunan bir cam cephe; köşede bir dijital ağ/devre deseni. Temiz enerji, doğa ve teknoloji temalı tema açılış görseli (tam sayfa).</w:t>
-            </w:r>
-          </w:p>
-          <w:p>
-            <w:pPr>
-              <w:jc w:val="both"/>
-              <w:rPr>
-                <w:rFonts w:ascii="Times New Roman" w:hAnsi="Times New Roman" w:cs="Times New Roman"/>
-                <w:lang w:val="tr-TR"/>
-              </w:rPr>
-            </w:pPr>
-            <w:r>
-              <w:rPr>
-                <w:rFonts w:ascii="Times New Roman" w:hAnsi="Times New Roman" w:cs="Times New Roman"/>
-                <w:lang w:val="tr-TR"/>
-              </w:rPr>
-              <w:t xml:space="preserve">Shutter ID: 2725586199 (vektör) — Solar panel with green leaves and sun, eco concept</w:t>
-            </w:r>
-          </w:p>
-        </w:tc>
-      </w:tr>
-    </w:tbl>
-    <w:p>
-      <w:pPr>
-        <w:jc w:val="both"/>
-        <w:rPr>
-          <w:rFonts w:ascii="Times New Roman" w:hAnsi="Times New Roman" w:cs="Times New Roman"/>
-          <w:lang w:val="tr-TR"/>
-        </w:rPr>
-      </w:pPr>
+      </w:pPr>
+      <w:r>
+        <w:drawing>
+          <wp:inline xmlns:a="http://schemas.openxmlformats.org/drawingml/2006/main" xmlns:pic="http://schemas.openxmlformats.org/drawingml/2006/picture">
+            <wp:extent cx="4692251" cy="4319999"/>
+            <wp:docPr id="900014" name="Picture 900014"/>
+            <wp:cNvGraphicFramePr>
+              <a:graphicFrameLocks noChangeAspect="1"/>
+            </wp:cNvGraphicFramePr>
+            <a:graphic>
+              <a:graphicData uri="http://schemas.openxmlformats.org/drawingml/2006/picture">
+                <pic:pic>
+                  <pic:nvPicPr>
+                    <pic:cNvPr id="0" name="2725586199_d.jpg"/>
+                    <pic:cNvPicPr/>
+                  </pic:nvPicPr>
+                  <pic:blipFill>
+                    <a:blip r:embed="rId11"/>
+                    <a:stretch>
+                      <a:fillRect/>
+                    </a:stretch>
+                  </pic:blipFill>
+                  <pic:spPr>
+                    <a:xfrm>
+                      <a:off x="0" y="0"/>
+                      <a:ext cx="4692251" cy="4319999"/>
+                    </a:xfrm>
+                    <a:prstGeom prst="rect"/>
+                  </pic:spPr>
+                </pic:pic>
+              </a:graphicData>
+            </a:graphic>
+          </wp:inline>
+        </w:drawing>
+      </w:r>
     </w:p>
     <w:p>
       <w:pPr>
         <w:jc w:val="center"/>
-        <w:rPr>
-          <w:rFonts w:ascii="Times New Roman" w:hAnsi="Times New Roman" w:cs="Times New Roman"/>
-          <w:lang w:val="tr-TR"/>
-        </w:rPr>
       </w:pPr>
       <w:r>
         <w:rPr>
           <w:rFonts w:ascii="Times New Roman" w:hAnsi="Times New Roman" w:cs="Times New Roman"/>
           <w:b/>
           <w:bCs/>
-          <w:lang w:val="tr-TR"/>
-        </w:rPr>
-        <w:t xml:space="preserve">Görsel A:</w:t>
-      </w:r>
-      <w:r>
-        <w:rPr>
-          <w:rFonts w:ascii="Times New Roman" w:hAnsi="Times New Roman" w:cs="Times New Roman"/>
-          <w:lang w:val="tr-TR"/>
-        </w:rPr>
-        <w:t xml:space="preserve"> Güneşten enerji, doğadan malzeme</w:t>
-      </w:r>
-    </w:p>
-    <w:p>
-      <w:pPr>
-        <w:jc w:val="both"/>
+          <w:highlight w:val="yellow"/>
+          <w:lang w:val="tr-TR"/>
+        </w:rPr>
+        <w:t xml:space="preserve">Shutter id: 2725586199 (bölüm kapağı, tam sayfa)</w:t>
+      </w:r>
+    </w:p>
+    <w:p>
+      <w:pPr>
+        <w:jc w:val="center"/>
+        <w:rPr>
+          <w:rFonts w:ascii="Times New Roman" w:hAnsi="Times New Roman" w:cs="Times New Roman"/>
+          <w:lang w:val="tr-TR"/>
+        </w:rPr>
+      </w:pPr>
+      <w:r>
         <w:rPr>
           <w:rFonts w:ascii="Times New Roman" w:hAnsi="Times New Roman" w:cs="Times New Roman"/>
           <w:b/>
           <w:bCs/>
           <w:lang w:val="tr-TR"/>
         </w:rPr>
-      </w:pPr>
-      <w:r>
+        <w:t xml:space="preserve">Görsel A:</w:t>
+      </w:r>
+      <w:r>
+        <w:rPr>
+          <w:rFonts w:ascii="Times New Roman" w:hAnsi="Times New Roman" w:cs="Times New Roman"/>
+          <w:lang w:val="tr-TR"/>
+        </w:rPr>
+        <w:t xml:space="preserve"> Güneşten enerji, doğadan malzeme</w:t>
+      </w:r>
+    </w:p>
+    <w:p>
+      <w:pPr>
+        <w:jc w:val="both"/>
         <w:rPr>
           <w:rFonts w:ascii="Times New Roman" w:hAnsi="Times New Roman" w:cs="Times New Roman"/>
           <w:b/>
           <w:bCs/>
           <w:lang w:val="tr-TR"/>
         </w:rPr>
-        <w:t xml:space="preserve">Temanın Anahtar Kavramları</w:t>
-      </w:r>
-    </w:p>
-    <w:p>
-      <w:pPr>
-        <w:ind w:left="360"/>
-        <w:jc w:val="both"/>
-        <w:rPr>
-          <w:rFonts w:ascii="Times New Roman" w:hAnsi="Times New Roman" w:cs="Times New Roman"/>
-          <w:lang w:val="tr-TR"/>
-        </w:rPr>
-      </w:pPr>
-      <w:r>
-        <w:rPr>
-          <w:rFonts w:ascii="Times New Roman" w:hAnsi="Times New Roman" w:cs="Times New Roman"/>
-          <w:lang w:val="tr-TR"/>
-        </w:rPr>
-        <w:t xml:space="preserve">• Biyobozunur polimer</w:t>
-      </w:r>
-    </w:p>
-    <w:p>
-      <w:pPr>
-        <w:ind w:left="360"/>
-        <w:jc w:val="both"/>
-        <w:rPr>
-          <w:rFonts w:ascii="Times New Roman" w:hAnsi="Times New Roman" w:cs="Times New Roman"/>
-          <w:lang w:val="tr-TR"/>
-        </w:rPr>
-      </w:pPr>
-      <w:r>
-        <w:rPr>
-          <w:rFonts w:ascii="Times New Roman" w:hAnsi="Times New Roman" w:cs="Times New Roman"/>
-          <w:lang w:val="tr-TR"/>
-        </w:rPr>
-        <w:t xml:space="preserve">• Biyopolimer</w:t>
-      </w:r>
-    </w:p>
-    <w:p>
-      <w:pPr>
-        <w:ind w:left="360"/>
-        <w:jc w:val="both"/>
-        <w:rPr>
-          <w:rFonts w:ascii="Times New Roman" w:hAnsi="Times New Roman" w:cs="Times New Roman"/>
-          <w:lang w:val="tr-TR"/>
-        </w:rPr>
-      </w:pPr>
-      <w:r>
-        <w:rPr>
-          <w:rFonts w:ascii="Times New Roman" w:hAnsi="Times New Roman" w:cs="Times New Roman"/>
-          <w:lang w:val="tr-TR"/>
-        </w:rPr>
-        <w:t xml:space="preserve">• Boyaya duyarlı güneş pili</w:t>
-      </w:r>
-    </w:p>
-    <w:p>
-      <w:pPr>
-        <w:ind w:left="360"/>
-        <w:jc w:val="both"/>
-        <w:rPr>
-          <w:rFonts w:ascii="Times New Roman" w:hAnsi="Times New Roman" w:cs="Times New Roman"/>
-          <w:lang w:val="tr-TR"/>
-        </w:rPr>
-      </w:pPr>
-      <w:r>
-        <w:rPr>
-          <w:rFonts w:ascii="Times New Roman" w:hAnsi="Times New Roman" w:cs="Times New Roman"/>
-          <w:lang w:val="tr-TR"/>
-        </w:rPr>
-        <w:t xml:space="preserve">• Fotosentez</w:t>
-      </w:r>
-    </w:p>
-    <w:p>
-      <w:pPr>
-        <w:ind w:left="360"/>
-        <w:jc w:val="both"/>
-        <w:rPr>
-          <w:rFonts w:ascii="Times New Roman" w:hAnsi="Times New Roman" w:cs="Times New Roman"/>
-          <w:lang w:val="tr-TR"/>
-        </w:rPr>
-      </w:pPr>
-      <w:r>
-        <w:rPr>
-          <w:rFonts w:ascii="Times New Roman" w:hAnsi="Times New Roman" w:cs="Times New Roman"/>
-          <w:lang w:val="tr-TR"/>
-        </w:rPr>
-        <w:t xml:space="preserve">• Güneş hücresi</w:t>
-      </w:r>
-    </w:p>
-    <w:p>
-      <w:pPr>
-        <w:ind w:left="360"/>
-        <w:jc w:val="both"/>
-        <w:rPr>
-          <w:rFonts w:ascii="Times New Roman" w:hAnsi="Times New Roman" w:cs="Times New Roman"/>
-          <w:lang w:val="tr-TR"/>
-        </w:rPr>
-      </w:pPr>
-      <w:r>
-        <w:rPr>
-          <w:rFonts w:ascii="Times New Roman" w:hAnsi="Times New Roman" w:cs="Times New Roman"/>
-          <w:lang w:val="tr-TR"/>
-        </w:rPr>
-        <w:t xml:space="preserve">• Nanoparçacıklı güneş pili</w:t>
-      </w:r>
-    </w:p>
-    <w:p>
-      <w:pPr>
-        <w:ind w:left="360"/>
-        <w:jc w:val="both"/>
-        <w:rPr>
-          <w:rFonts w:ascii="Times New Roman" w:hAnsi="Times New Roman" w:cs="Times New Roman"/>
-          <w:lang w:val="tr-TR"/>
-        </w:rPr>
-      </w:pPr>
-      <w:r>
-        <w:rPr>
-          <w:rFonts w:ascii="Times New Roman" w:hAnsi="Times New Roman" w:cs="Times New Roman"/>
-          <w:lang w:val="tr-TR"/>
-        </w:rPr>
-        <w:t xml:space="preserve">• Nanopolimer</w:t>
-      </w:r>
-    </w:p>
-    <w:p>
-      <w:pPr>
-        <w:ind w:left="360"/>
-        <w:jc w:val="both"/>
-        <w:rPr>
-          <w:rFonts w:ascii="Times New Roman" w:hAnsi="Times New Roman" w:cs="Times New Roman"/>
-          <w:lang w:val="tr-TR"/>
-        </w:rPr>
-      </w:pPr>
-      <w:r>
-        <w:rPr>
-          <w:rFonts w:ascii="Times New Roman" w:hAnsi="Times New Roman" w:cs="Times New Roman"/>
-          <w:lang w:val="tr-TR"/>
-        </w:rPr>
-        <w:t xml:space="preserve">• Yapay zekâ</w:t>
-      </w:r>
-    </w:p>
-    <w:p>
-      <w:pPr>
-        <w:jc w:val="both"/>
+      </w:pPr>
+      <w:r>
         <w:rPr>
           <w:rFonts w:ascii="Times New Roman" w:hAnsi="Times New Roman" w:cs="Times New Roman"/>
           <w:b/>
           <w:bCs/>
           <w:lang w:val="tr-TR"/>
         </w:rPr>
-      </w:pPr>
-      <w:r>
+        <w:t xml:space="preserve">Temanın Anahtar Kavramları</w:t>
+      </w:r>
+    </w:p>
+    <w:p>
+      <w:pPr>
+        <w:ind w:left="360"/>
+        <w:jc w:val="both"/>
+        <w:rPr>
+          <w:rFonts w:ascii="Times New Roman" w:hAnsi="Times New Roman" w:cs="Times New Roman"/>
+          <w:lang w:val="tr-TR"/>
+        </w:rPr>
+      </w:pPr>
+      <w:r>
+        <w:rPr>
+          <w:rFonts w:ascii="Times New Roman" w:hAnsi="Times New Roman" w:cs="Times New Roman"/>
+          <w:lang w:val="tr-TR"/>
+        </w:rPr>
+        <w:t xml:space="preserve">• Biyobozunur polimer</w:t>
+      </w:r>
+    </w:p>
+    <w:p>
+      <w:pPr>
+        <w:ind w:left="360"/>
+        <w:jc w:val="both"/>
+        <w:rPr>
+          <w:rFonts w:ascii="Times New Roman" w:hAnsi="Times New Roman" w:cs="Times New Roman"/>
+          <w:lang w:val="tr-TR"/>
+        </w:rPr>
+      </w:pPr>
+      <w:r>
+        <w:rPr>
+          <w:rFonts w:ascii="Times New Roman" w:hAnsi="Times New Roman" w:cs="Times New Roman"/>
+          <w:lang w:val="tr-TR"/>
+        </w:rPr>
+        <w:t xml:space="preserve">• Biyopolimer</w:t>
+      </w:r>
+    </w:p>
+    <w:p>
+      <w:pPr>
+        <w:ind w:left="360"/>
+        <w:jc w:val="both"/>
+        <w:rPr>
+          <w:rFonts w:ascii="Times New Roman" w:hAnsi="Times New Roman" w:cs="Times New Roman"/>
+          <w:lang w:val="tr-TR"/>
+        </w:rPr>
+      </w:pPr>
+      <w:r>
+        <w:rPr>
+          <w:rFonts w:ascii="Times New Roman" w:hAnsi="Times New Roman" w:cs="Times New Roman"/>
+          <w:lang w:val="tr-TR"/>
+        </w:rPr>
+        <w:t xml:space="preserve">• Boyaya duyarlı güneş pili</w:t>
+      </w:r>
+    </w:p>
+    <w:p>
+      <w:pPr>
+        <w:ind w:left="360"/>
+        <w:jc w:val="both"/>
+        <w:rPr>
+          <w:rFonts w:ascii="Times New Roman" w:hAnsi="Times New Roman" w:cs="Times New Roman"/>
+          <w:lang w:val="tr-TR"/>
+        </w:rPr>
+      </w:pPr>
+      <w:r>
+        <w:rPr>
+          <w:rFonts w:ascii="Times New Roman" w:hAnsi="Times New Roman" w:cs="Times New Roman"/>
+          <w:lang w:val="tr-TR"/>
+        </w:rPr>
+        <w:t xml:space="preserve">• Fotosentez</w:t>
+      </w:r>
+    </w:p>
+    <w:p>
+      <w:pPr>
+        <w:ind w:left="360"/>
+        <w:jc w:val="both"/>
+        <w:rPr>
+          <w:rFonts w:ascii="Times New Roman" w:hAnsi="Times New Roman" w:cs="Times New Roman"/>
+          <w:lang w:val="tr-TR"/>
+        </w:rPr>
+      </w:pPr>
+      <w:r>
+        <w:rPr>
+          <w:rFonts w:ascii="Times New Roman" w:hAnsi="Times New Roman" w:cs="Times New Roman"/>
+          <w:lang w:val="tr-TR"/>
+        </w:rPr>
+        <w:t xml:space="preserve">• Güneş hücresi</w:t>
+      </w:r>
+    </w:p>
+    <w:p>
+      <w:pPr>
+        <w:ind w:left="360"/>
+        <w:jc w:val="both"/>
+        <w:rPr>
+          <w:rFonts w:ascii="Times New Roman" w:hAnsi="Times New Roman" w:cs="Times New Roman"/>
+          <w:lang w:val="tr-TR"/>
+        </w:rPr>
+      </w:pPr>
+      <w:r>
+        <w:rPr>
+          <w:rFonts w:ascii="Times New Roman" w:hAnsi="Times New Roman" w:cs="Times New Roman"/>
+          <w:lang w:val="tr-TR"/>
+        </w:rPr>
+        <w:t xml:space="preserve">• Nanoparçacıklı güneş pili</w:t>
+      </w:r>
+    </w:p>
+    <w:p>
+      <w:pPr>
+        <w:ind w:left="360"/>
+        <w:jc w:val="both"/>
+        <w:rPr>
+          <w:rFonts w:ascii="Times New Roman" w:hAnsi="Times New Roman" w:cs="Times New Roman"/>
+          <w:lang w:val="tr-TR"/>
+        </w:rPr>
+      </w:pPr>
+      <w:r>
+        <w:rPr>
+          <w:rFonts w:ascii="Times New Roman" w:hAnsi="Times New Roman" w:cs="Times New Roman"/>
+          <w:lang w:val="tr-TR"/>
+        </w:rPr>
+        <w:t xml:space="preserve">• Nanopolimer</w:t>
+      </w:r>
+    </w:p>
+    <w:p>
+      <w:pPr>
+        <w:ind w:left="360"/>
+        <w:jc w:val="both"/>
+        <w:rPr>
+          <w:rFonts w:ascii="Times New Roman" w:hAnsi="Times New Roman" w:cs="Times New Roman"/>
+          <w:lang w:val="tr-TR"/>
+        </w:rPr>
+      </w:pPr>
+      <w:r>
+        <w:rPr>
+          <w:rFonts w:ascii="Times New Roman" w:hAnsi="Times New Roman" w:cs="Times New Roman"/>
+          <w:lang w:val="tr-TR"/>
+        </w:rPr>
+        <w:t xml:space="preserve">• Yapay zekâ</w:t>
+      </w:r>
+    </w:p>
+    <w:p>
+      <w:pPr>
+        <w:jc w:val="both"/>
         <w:rPr>
           <w:rFonts w:ascii="Times New Roman" w:hAnsi="Times New Roman" w:cs="Times New Roman"/>
           <w:b/>
           <w:bCs/>
           <w:lang w:val="tr-TR"/>
         </w:rPr>
-        <w:t xml:space="preserve">Bu Temada Neler Öğreneceksiniz?</w:t>
-      </w:r>
-    </w:p>
-    <w:p>
-      <w:pPr>
-        <w:ind w:left="360"/>
-        <w:jc w:val="both"/>
-        <w:rPr>
-          <w:rFonts w:ascii="Times New Roman" w:hAnsi="Times New Roman" w:cs="Times New Roman"/>
-          <w:lang w:val="tr-TR"/>
-        </w:rPr>
-      </w:pPr>
-      <w:r>
-        <w:rPr>
-          <w:rFonts w:ascii="Times New Roman" w:hAnsi="Times New Roman" w:cs="Times New Roman"/>
-          <w:lang w:val="tr-TR"/>
-        </w:rPr>
-        <w:t xml:space="preserve">• Boyaya duyarlı güneş pillerinin verimliliklerine ilişkin bilimsel çıkarım yapacaksınız.</w:t>
-      </w:r>
-    </w:p>
-    <w:p>
-      <w:pPr>
-        <w:ind w:left="360"/>
-        <w:jc w:val="both"/>
-        <w:rPr>
-          <w:rFonts w:ascii="Times New Roman" w:hAnsi="Times New Roman" w:cs="Times New Roman"/>
-          <w:lang w:val="tr-TR"/>
-        </w:rPr>
-      </w:pPr>
-      <w:r>
-        <w:rPr>
-          <w:rFonts w:ascii="Times New Roman" w:hAnsi="Times New Roman" w:cs="Times New Roman"/>
-          <w:lang w:val="tr-TR"/>
-        </w:rPr>
-        <w:t xml:space="preserve">• Biyobozunur polimer eldesinde kullanılacak bileşenlere karar vereceksiniz.</w:t>
-      </w:r>
-    </w:p>
-    <w:p>
-      <w:pPr>
-        <w:ind w:left="360"/>
-        <w:jc w:val="both"/>
-        <w:rPr>
-          <w:rFonts w:ascii="Times New Roman" w:hAnsi="Times New Roman" w:cs="Times New Roman"/>
-          <w:lang w:val="tr-TR"/>
-        </w:rPr>
-      </w:pPr>
-      <w:r>
-        <w:rPr>
-          <w:rFonts w:ascii="Times New Roman" w:hAnsi="Times New Roman" w:cs="Times New Roman"/>
-          <w:lang w:val="tr-TR"/>
-        </w:rPr>
-        <w:t xml:space="preserve">• Yapay zekâ uygulamalarının sürdürülebilirliğe etkilerine yönelik eleştirel düşüneceksiniz.</w:t>
-      </w:r>
-    </w:p>
-    <w:p>
-      <w:pPr>
-        <w:jc w:val="both"/>
+      </w:pPr>
+      <w:r>
         <w:rPr>
           <w:rFonts w:ascii="Times New Roman" w:hAnsi="Times New Roman" w:cs="Times New Roman"/>
           <w:b/>
           <w:bCs/>
           <w:lang w:val="tr-TR"/>
         </w:rPr>
-      </w:pPr>
-      <w:r>
+        <w:t xml:space="preserve">Bu Temada Neler Öğreneceksiniz?</w:t>
+      </w:r>
+    </w:p>
+    <w:p>
+      <w:pPr>
+        <w:ind w:left="360"/>
+        <w:jc w:val="both"/>
+        <w:rPr>
+          <w:rFonts w:ascii="Times New Roman" w:hAnsi="Times New Roman" w:cs="Times New Roman"/>
+          <w:lang w:val="tr-TR"/>
+        </w:rPr>
+      </w:pPr>
+      <w:r>
+        <w:rPr>
+          <w:rFonts w:ascii="Times New Roman" w:hAnsi="Times New Roman" w:cs="Times New Roman"/>
+          <w:lang w:val="tr-TR"/>
+        </w:rPr>
+        <w:t xml:space="preserve">• Boyaya duyarlı güneş pillerinin verimliliklerine ilişkin bilimsel çıkarım yapacaksınız.</w:t>
+      </w:r>
+    </w:p>
+    <w:p>
+      <w:pPr>
+        <w:ind w:left="360"/>
+        <w:jc w:val="both"/>
+        <w:rPr>
+          <w:rFonts w:ascii="Times New Roman" w:hAnsi="Times New Roman" w:cs="Times New Roman"/>
+          <w:lang w:val="tr-TR"/>
+        </w:rPr>
+      </w:pPr>
+      <w:r>
+        <w:rPr>
+          <w:rFonts w:ascii="Times New Roman" w:hAnsi="Times New Roman" w:cs="Times New Roman"/>
+          <w:lang w:val="tr-TR"/>
+        </w:rPr>
+        <w:t xml:space="preserve">• Biyobozunur polimer eldesinde kullanılacak bileşenlere karar vereceksiniz.</w:t>
+      </w:r>
+    </w:p>
+    <w:p>
+      <w:pPr>
+        <w:ind w:left="360"/>
+        <w:jc w:val="both"/>
+        <w:rPr>
+          <w:rFonts w:ascii="Times New Roman" w:hAnsi="Times New Roman" w:cs="Times New Roman"/>
+          <w:lang w:val="tr-TR"/>
+        </w:rPr>
+      </w:pPr>
+      <w:r>
+        <w:rPr>
+          <w:rFonts w:ascii="Times New Roman" w:hAnsi="Times New Roman" w:cs="Times New Roman"/>
+          <w:lang w:val="tr-TR"/>
+        </w:rPr>
+        <w:t xml:space="preserve">• Yapay zekâ uygulamalarının sürdürülebilirliğe etkilerine yönelik eleştirel düşüneceksiniz.</w:t>
+      </w:r>
+    </w:p>
+    <w:p>
+      <w:pPr>
+        <w:jc w:val="both"/>
         <w:rPr>
           <w:rFonts w:ascii="Times New Roman" w:hAnsi="Times New Roman" w:cs="Times New Roman"/>
           <w:b/>
           <w:bCs/>
           <w:lang w:val="tr-TR"/>
         </w:rPr>
+      </w:pPr>
+      <w:r>
+        <w:rPr>
+          <w:rFonts w:ascii="Times New Roman" w:hAnsi="Times New Roman" w:cs="Times New Roman"/>
+          <w:b/>
+          <w:bCs/>
+          <w:lang w:val="tr-TR"/>
+        </w:rPr>
         <w:t xml:space="preserve">BÖLÜM: Nanobilim, Yeşil Kimya ve Sürdürülebilirlik</w:t>
       </w:r>
     </w:p>
-    <w:tbl>
-      <w:tblPr>
-        <w:tblW w:w="9000" w:type="dxa"/>
+    <w:p>
+      <w:pPr>
         <w:jc w:val="center"/>
-        <w:tblBorders>
-          <w:top w:val="single" w:sz="8" w:space="0" w:color="7F7F7F"/>
-          <w:left w:val="single" w:sz="8" w:space="0" w:color="7F7F7F"/>
-          <w:bottom w:val="single" w:sz="8" w:space="0" w:color="7F7F7F"/>
-          <w:right w:val="single" w:sz="8" w:space="0" w:color="7F7F7F"/>
-        </w:tblBorders>
-      </w:tblPr>
-      <w:tblGrid>
-        <w:gridCol w:w="9000"/>
-      </w:tblGrid>
-      <w:tr>
-        <w:tc>
-          <w:tcPr>
-            <w:tcW w:w="9000" w:type="dxa"/>
-            <w:shd w:val="clear" w:color="auto" w:fill="EDEDED"/>
-          </w:tcPr>
-          <w:p>
-            <w:pPr>
-              <w:jc w:val="both"/>
-              <w:rPr>
-                <w:rFonts w:ascii="Times New Roman" w:hAnsi="Times New Roman" w:cs="Times New Roman"/>
-                <w:lang w:val="tr-TR"/>
-              </w:rPr>
-            </w:pPr>
-            <w:r>
-              <w:rPr>
-                <w:rFonts w:ascii="Times New Roman" w:hAnsi="Times New Roman" w:cs="Times New Roman"/>
-                <w:lang w:val="tr-TR"/>
-              </w:rPr>
-              <w:t xml:space="preserve">GÖRSEL ALANI (Bölüm kapağı, tam sayfa; Shutterstock)</w:t>
-            </w:r>
-          </w:p>
-          <w:p>
-            <w:pPr>
-              <w:jc w:val="both"/>
-              <w:rPr>
-                <w:rFonts w:ascii="Times New Roman" w:hAnsi="Times New Roman" w:cs="Times New Roman"/>
-                <w:lang w:val="tr-TR"/>
-              </w:rPr>
-            </w:pPr>
-            <w:r>
-              <w:rPr>
-                <w:rFonts w:ascii="Times New Roman" w:hAnsi="Times New Roman" w:cs="Times New Roman"/>
-                <w:lang w:val="tr-TR"/>
-              </w:rPr>
-              <w:t xml:space="preserve">Tarif: Yeşil bir arazide güneş panelleri ve rüzgâr türbinleri, ön planda güneş ışığı alan taze yapraklar; doğa ile teknolojinin uyumunu anlatan sürdürülebilirlik temalı görsel (tam sayfa bölüm kapağı).</w:t>
-            </w:r>
-          </w:p>
-          <w:p>
-            <w:pPr>
-              <w:jc w:val="both"/>
-              <w:rPr>
-                <w:rFonts w:ascii="Times New Roman" w:hAnsi="Times New Roman" w:cs="Times New Roman"/>
-                <w:lang w:val="tr-TR"/>
-              </w:rPr>
-            </w:pPr>
-            <w:r>
-              <w:rPr>
-                <w:rFonts w:ascii="Times New Roman" w:hAnsi="Times New Roman" w:cs="Times New Roman"/>
-                <w:lang w:val="tr-TR"/>
-              </w:rPr>
-              <w:t xml:space="preserve">Shutter ID: 2842308781 (fotoğraf) — Wind turbines and solar panels on green hills</w:t>
-            </w:r>
-          </w:p>
-        </w:tc>
-      </w:tr>
-    </w:tbl>
-    <w:p>
-      <w:pPr>
-        <w:jc w:val="both"/>
-        <w:rPr>
-          <w:rFonts w:ascii="Times New Roman" w:hAnsi="Times New Roman" w:cs="Times New Roman"/>
-          <w:lang w:val="tr-TR"/>
-        </w:rPr>
-      </w:pPr>
+      </w:pPr>
+      <w:r>
+        <w:drawing>
+          <wp:inline xmlns:a="http://schemas.openxmlformats.org/drawingml/2006/main" xmlns:pic="http://schemas.openxmlformats.org/drawingml/2006/picture">
+            <wp:extent cx="5289795" cy="4319999"/>
+            <wp:docPr id="900015" name="Picture 900015"/>
+            <wp:cNvGraphicFramePr>
+              <a:graphicFrameLocks noChangeAspect="1"/>
+            </wp:cNvGraphicFramePr>
+            <a:graphic>
+              <a:graphicData uri="http://schemas.openxmlformats.org/drawingml/2006/picture">
+                <pic:pic>
+                  <pic:nvPicPr>
+                    <pic:cNvPr id="0" name="2842308781_d.jpg"/>
+                    <pic:cNvPicPr/>
+                  </pic:nvPicPr>
+                  <pic:blipFill>
+                    <a:blip r:embed="rId12"/>
+                    <a:stretch>
+                      <a:fillRect/>
+                    </a:stretch>
+                  </pic:blipFill>
+                  <pic:spPr>
+                    <a:xfrm>
+                      <a:off x="0" y="0"/>
+                      <a:ext cx="5289795" cy="4319999"/>
+                    </a:xfrm>
+                    <a:prstGeom prst="rect"/>
+                  </pic:spPr>
+                </pic:pic>
+              </a:graphicData>
+            </a:graphic>
+          </wp:inline>
+        </w:drawing>
+      </w:r>
+    </w:p>
+    <w:p>
+      <w:pPr>
+        <w:jc w:val="center"/>
+      </w:pPr>
+      <w:r>
+        <w:rPr>
+          <w:rFonts w:ascii="Times New Roman" w:hAnsi="Times New Roman" w:cs="Times New Roman"/>
+          <w:b/>
+          <w:bCs/>
+          <w:highlight w:val="yellow"/>
+          <w:lang w:val="tr-TR"/>
+        </w:rPr>
+        <w:t xml:space="preserve">Shutter id: 2842308781 (bölüm kapağı, tam sayfa)</w:t>
+      </w:r>
     </w:p>
     <w:tbl>
       <w:tblPr>
@@ -1076,85 +1024,59 @@
         <w:t xml:space="preserve">Evlerimizde uzaktan kumandalardan oyuncaklara, saatlerden el fenerlerine kadar pek çok cihaz pille çalışır. Kullanım ömrü dolan pillerin bir kısmı atık pil toplama kutularına bırakılırken bir kısmı ne yazık ki evsel çöplerle birlikte atılır.</w:t>
       </w:r>
     </w:p>
-    <w:tbl>
-      <w:tblPr>
-        <w:tblW w:w="9000" w:type="dxa"/>
+    <w:p>
+      <w:pPr>
         <w:jc w:val="center"/>
-        <w:tblBorders>
-          <w:top w:val="single" w:sz="8" w:space="0" w:color="7F7F7F"/>
-          <w:left w:val="single" w:sz="8" w:space="0" w:color="7F7F7F"/>
-          <w:bottom w:val="single" w:sz="8" w:space="0" w:color="7F7F7F"/>
-          <w:right w:val="single" w:sz="8" w:space="0" w:color="7F7F7F"/>
-        </w:tblBorders>
-      </w:tblPr>
-      <w:tblGrid>
-        <w:gridCol w:w="9000"/>
-      </w:tblGrid>
-      <w:tr>
-        <w:tc>
-          <w:tcPr>
-            <w:tcW w:w="9000" w:type="dxa"/>
-            <w:shd w:val="clear" w:color="auto" w:fill="EDEDED"/>
-          </w:tcPr>
-          <w:p>
-            <w:pPr>
-              <w:jc w:val="both"/>
-              <w:rPr>
-                <w:rFonts w:ascii="Times New Roman" w:hAnsi="Times New Roman" w:cs="Times New Roman"/>
-                <w:lang w:val="tr-TR"/>
-              </w:rPr>
-            </w:pPr>
-            <w:r>
-              <w:rPr>
-                <w:rFonts w:ascii="Times New Roman" w:hAnsi="Times New Roman" w:cs="Times New Roman"/>
-                <w:lang w:val="tr-TR"/>
-              </w:rPr>
-              <w:t xml:space="preserve">GÖRSEL ALANI (Shutterstock)</w:t>
-            </w:r>
-          </w:p>
-          <w:p>
-            <w:pPr>
-              <w:jc w:val="both"/>
-              <w:rPr>
-                <w:rFonts w:ascii="Times New Roman" w:hAnsi="Times New Roman" w:cs="Times New Roman"/>
-                <w:lang w:val="tr-TR"/>
-              </w:rPr>
-            </w:pPr>
-            <w:r>
-              <w:rPr>
-                <w:rFonts w:ascii="Times New Roman" w:hAnsi="Times New Roman" w:cs="Times New Roman"/>
-                <w:lang w:val="tr-TR"/>
-              </w:rPr>
-              <w:t xml:space="preserve">Tarif: Okul ya da market girişindeki atık pil toplama kutusuna kullanılmış kalem pilleri bırakan bir el (marka/logo görünmesin).</w:t>
-            </w:r>
-          </w:p>
-          <w:p>
-            <w:pPr>
-              <w:jc w:val="both"/>
-              <w:rPr>
-                <w:rFonts w:ascii="Times New Roman" w:hAnsi="Times New Roman" w:cs="Times New Roman"/>
-                <w:lang w:val="tr-TR"/>
-              </w:rPr>
-            </w:pPr>
-            <w:r>
-              <w:rPr>
-                <w:rFonts w:ascii="Times New Roman" w:hAnsi="Times New Roman" w:cs="Times New Roman"/>
-                <w:lang w:val="tr-TR"/>
-              </w:rPr>
-              <w:t xml:space="preserve">Shutter ID: 2689278777 (fotoğraf) — Battery recycling box</w:t>
-            </w:r>
-          </w:p>
-        </w:tc>
-      </w:tr>
-    </w:tbl>
-    <w:p>
-      <w:pPr>
-        <w:jc w:val="both"/>
-        <w:rPr>
-          <w:rFonts w:ascii="Times New Roman" w:hAnsi="Times New Roman" w:cs="Times New Roman"/>
-          <w:lang w:val="tr-TR"/>
-        </w:rPr>
-      </w:pPr>
+      </w:pPr>
+      <w:r>
+        <w:drawing>
+          <wp:inline xmlns:a="http://schemas.openxmlformats.org/drawingml/2006/main" xmlns:pic="http://schemas.openxmlformats.org/drawingml/2006/picture">
+            <wp:extent cx="1570275" cy="2520000"/>
+            <wp:docPr id="900016" name="Picture 900016"/>
+            <wp:cNvGraphicFramePr>
+              <a:graphicFrameLocks noChangeAspect="1"/>
+            </wp:cNvGraphicFramePr>
+            <a:graphic>
+              <a:graphicData uri="http://schemas.openxmlformats.org/drawingml/2006/picture">
+                <pic:pic>
+                  <pic:nvPicPr>
+                    <pic:cNvPr id="0" name="2689278777_d.jpg"/>
+                    <pic:cNvPicPr/>
+                  </pic:nvPicPr>
+                  <pic:blipFill>
+                    <a:blip r:embed="rId13"/>
+                    <a:stretch>
+                      <a:fillRect/>
+                    </a:stretch>
+                  </pic:blipFill>
+                  <pic:spPr>
+                    <a:xfrm>
+                      <a:off x="0" y="0"/>
+                      <a:ext cx="1570275" cy="2520000"/>
+                    </a:xfrm>
+                    <a:prstGeom prst="rect"/>
+                  </pic:spPr>
+                </pic:pic>
+              </a:graphicData>
+            </a:graphic>
+          </wp:inline>
+        </w:drawing>
+      </w:r>
+    </w:p>
+    <w:p>
+      <w:pPr>
+        <w:jc w:val="center"/>
+      </w:pPr>
+      <w:r>
+        <w:rPr>
+          <w:rFonts w:ascii="Times New Roman" w:hAnsi="Times New Roman" w:cs="Times New Roman"/>
+          <w:b/>
+          <w:bCs/>
+          <w:highlight w:val="yellow"/>
+          <w:lang w:val="tr-TR"/>
+        </w:rPr>
+        <w:t xml:space="preserve">Shutter id: 2689278777</w:t>
+      </w:r>
     </w:p>
     <w:p>
       <w:pPr>
@@ -1460,85 +1382,59 @@
         <w:t xml:space="preserve">Bahçedeki bir ağacın yaprakları her gün güneş ışığını soğurarak havadaki karbon dioksit ve topraktan aldığı su ile besin üretir. Binaların çatılarındaki koyu renkli güneş panelleri ise ışığı doğrudan elektriğe dönüştürür (Görsel C). Son yıllarda bina cephelerinde, sırt çantalarında ve kapalı ortamda çalışan küçük elektronik cihazlarda kırmızı, turuncu ya da yeşil renkli, yarı saydam güneş hücreleri de kullanılmaya başlanmıştır (Görsel D). Peki, bir yaprağın ışığı kullanma biçimi ile bir güneş hücresinin çalışması arasında bir benzerlik olabilir mi? Böğürtlenin ya da karadutun rengini veren boya maddesi elektrik üretmek için kullanılabilir mi? Farklı türdeki güneş pillerinden hangisi hangi koşulda daha verimli çalışır ve hangisi çevre için daha uygundur? Bu soruların cevabını bir etkinlik yaparak keşfediniz. Analiz ve Keşif Atölyesi 3.1.’de bilimsel çıkarım yapacaksınız: Farklı güneş pillerinin niteliklerini tanımlayacak, hazır veri setlerinden ve kendi hazırladığınız hücreden veri toplayıp kaydedecek, bu verileri yorumlayarak yeşil kimya ve sürdürülebilir kalkınma açısından değerlendireceksiniz. Grubunuzla iş birliği yaparken fikirlerinizi açıkça paylaşacak, arkadaşlarınızın bakış açısını anlamaya çalışacak; temiz enerjiye duyarlılık, tasarruf ve temizlik değerlerini de destekleyeceksiniz.</w:t>
       </w:r>
     </w:p>
-    <w:tbl>
-      <w:tblPr>
-        <w:tblW w:w="9000" w:type="dxa"/>
+    <w:p>
+      <w:pPr>
         <w:jc w:val="center"/>
-        <w:tblBorders>
-          <w:top w:val="single" w:sz="8" w:space="0" w:color="7F7F7F"/>
-          <w:left w:val="single" w:sz="8" w:space="0" w:color="7F7F7F"/>
-          <w:bottom w:val="single" w:sz="8" w:space="0" w:color="7F7F7F"/>
-          <w:right w:val="single" w:sz="8" w:space="0" w:color="7F7F7F"/>
-        </w:tblBorders>
-      </w:tblPr>
-      <w:tblGrid>
-        <w:gridCol w:w="9000"/>
-      </w:tblGrid>
-      <w:tr>
-        <w:tc>
-          <w:tcPr>
-            <w:tcW w:w="9000" w:type="dxa"/>
-            <w:shd w:val="clear" w:color="auto" w:fill="EDEDED"/>
-          </w:tcPr>
-          <w:p>
-            <w:pPr>
-              <w:jc w:val="both"/>
-              <w:rPr>
-                <w:rFonts w:ascii="Times New Roman" w:hAnsi="Times New Roman" w:cs="Times New Roman"/>
-                <w:lang w:val="tr-TR"/>
-              </w:rPr>
-            </w:pPr>
-            <w:r>
-              <w:rPr>
-                <w:rFonts w:ascii="Times New Roman" w:hAnsi="Times New Roman" w:cs="Times New Roman"/>
-                <w:lang w:val="tr-TR"/>
-              </w:rPr>
-              <w:t xml:space="preserve">GÖRSEL ALANI (Shutterstock)</w:t>
-            </w:r>
-          </w:p>
-          <w:p>
-            <w:pPr>
-              <w:jc w:val="both"/>
-              <w:rPr>
-                <w:rFonts w:ascii="Times New Roman" w:hAnsi="Times New Roman" w:cs="Times New Roman"/>
-                <w:lang w:val="tr-TR"/>
-              </w:rPr>
-            </w:pPr>
-            <w:r>
-              <w:rPr>
-                <w:rFonts w:ascii="Times New Roman" w:hAnsi="Times New Roman" w:cs="Times New Roman"/>
-                <w:lang w:val="tr-TR"/>
-              </w:rPr>
-              <w:t xml:space="preserve">Tarif: Bir evin ya da okulun çatısına yerleştirilmiş koyu mavi-siyah renkli silisyum güneş panelleri.</w:t>
-            </w:r>
-          </w:p>
-          <w:p>
-            <w:pPr>
-              <w:jc w:val="both"/>
-              <w:rPr>
-                <w:rFonts w:ascii="Times New Roman" w:hAnsi="Times New Roman" w:cs="Times New Roman"/>
-                <w:lang w:val="tr-TR"/>
-              </w:rPr>
-            </w:pPr>
-            <w:r>
-              <w:rPr>
-                <w:rFonts w:ascii="Times New Roman" w:hAnsi="Times New Roman" w:cs="Times New Roman"/>
-                <w:lang w:val="tr-TR"/>
-              </w:rPr>
-              <w:t xml:space="preserve">Shutter ID: 2745706979 (fotoğraf) — Rooftop solar panel installation</w:t>
-            </w:r>
-          </w:p>
-        </w:tc>
-      </w:tr>
-    </w:tbl>
-    <w:p>
-      <w:pPr>
-        <w:jc w:val="both"/>
-        <w:rPr>
-          <w:rFonts w:ascii="Times New Roman" w:hAnsi="Times New Roman" w:cs="Times New Roman"/>
-          <w:lang w:val="tr-TR"/>
-        </w:rPr>
-      </w:pPr>
+      </w:pPr>
+      <w:r>
+        <w:drawing>
+          <wp:inline xmlns:a="http://schemas.openxmlformats.org/drawingml/2006/main" xmlns:pic="http://schemas.openxmlformats.org/drawingml/2006/picture">
+            <wp:extent cx="4195338" cy="2520000"/>
+            <wp:docPr id="900017" name="Picture 900017"/>
+            <wp:cNvGraphicFramePr>
+              <a:graphicFrameLocks noChangeAspect="1"/>
+            </wp:cNvGraphicFramePr>
+            <a:graphic>
+              <a:graphicData uri="http://schemas.openxmlformats.org/drawingml/2006/picture">
+                <pic:pic>
+                  <pic:nvPicPr>
+                    <pic:cNvPr id="0" name="2745706979_d.jpg"/>
+                    <pic:cNvPicPr/>
+                  </pic:nvPicPr>
+                  <pic:blipFill>
+                    <a:blip r:embed="rId14"/>
+                    <a:stretch>
+                      <a:fillRect/>
+                    </a:stretch>
+                  </pic:blipFill>
+                  <pic:spPr>
+                    <a:xfrm>
+                      <a:off x="0" y="0"/>
+                      <a:ext cx="4195338" cy="2520000"/>
+                    </a:xfrm>
+                    <a:prstGeom prst="rect"/>
+                  </pic:spPr>
+                </pic:pic>
+              </a:graphicData>
+            </a:graphic>
+          </wp:inline>
+        </w:drawing>
+      </w:r>
+    </w:p>
+    <w:p>
+      <w:pPr>
+        <w:jc w:val="center"/>
+      </w:pPr>
+      <w:r>
+        <w:rPr>
+          <w:rFonts w:ascii="Times New Roman" w:hAnsi="Times New Roman" w:cs="Times New Roman"/>
+          <w:b/>
+          <w:bCs/>
+          <w:highlight w:val="yellow"/>
+          <w:lang w:val="tr-TR"/>
+        </w:rPr>
+        <w:t xml:space="preserve">Shutter id: 2745706979</w:t>
+      </w:r>
     </w:p>
     <w:p>
       <w:pPr>

</xml_diff>

<commit_message>
3.1 ve dijital tema 3: Shutter karsiligi olmayan gorsel alanlari cizimlerle dolduruldu (yaprak-hucre, renkli hucre cephesi, boyaya duyarli hucre kesiti ve elektron akisi, biyopolimer yasam dongusu)
</commit_message>
<xml_diff>
--- a/Kim12-3-1-Boyaya-Duyarli-Gunes-Pilleri.docx
+++ b/Kim12-3-1-Boyaya-Duyarli-Gunes-Pilleri.docx
@@ -422,93 +422,45 @@
         <w:t xml:space="preserve">Shutter id: 2842308781 (bölüm kapağı, tam sayfa)</w:t>
       </w:r>
     </w:p>
-    <w:tbl>
-      <w:tblPr>
-        <w:tblW w:w="9000" w:type="dxa"/>
+    <w:p>
+      <w:pPr>
         <w:jc w:val="center"/>
-        <w:tblBorders>
-          <w:top w:val="single" w:sz="8" w:space="0" w:color="7F7F7F"/>
-          <w:left w:val="single" w:sz="8" w:space="0" w:color="7F7F7F"/>
-          <w:bottom w:val="single" w:sz="8" w:space="0" w:color="7F7F7F"/>
-          <w:right w:val="single" w:sz="8" w:space="0" w:color="7F7F7F"/>
-        </w:tblBorders>
-      </w:tblPr>
-      <w:tblGrid>
-        <w:gridCol w:w="9000"/>
-      </w:tblGrid>
-      <w:tr>
-        <w:tc>
-          <w:tcPr>
-            <w:tcW w:w="9000" w:type="dxa"/>
-            <w:shd w:val="clear" w:color="auto" w:fill="EDEDED"/>
-          </w:tcPr>
-          <w:p>
-            <w:pPr>
-              <w:jc w:val="both"/>
-              <w:rPr>
-                <w:rFonts w:ascii="Times New Roman" w:hAnsi="Times New Roman" w:cs="Times New Roman"/>
-                <w:lang w:val="tr-TR"/>
-              </w:rPr>
-            </w:pPr>
-            <w:r>
-              <w:rPr>
-                <w:rFonts w:ascii="Times New Roman" w:hAnsi="Times New Roman" w:cs="Times New Roman"/>
-                <w:lang w:val="tr-TR"/>
-              </w:rPr>
-              <w:t xml:space="preserve">GÖRSEL ALANI</w:t>
-            </w:r>
-          </w:p>
-          <w:p>
-            <w:pPr>
-              <w:jc w:val="both"/>
-              <w:rPr>
-                <w:rFonts w:ascii="Times New Roman" w:hAnsi="Times New Roman" w:cs="Times New Roman"/>
-                <w:lang w:val="tr-TR"/>
-              </w:rPr>
-            </w:pPr>
-            <w:r>
-              <w:rPr>
-                <w:rFonts w:ascii="Times New Roman" w:hAnsi="Times New Roman" w:cs="Times New Roman"/>
-                <w:lang w:val="tr-TR"/>
-              </w:rPr>
-              <w:t xml:space="preserve">Tarif: Bir yaprağın yakın çekimi; yaprağın üzerinde ince güneş hücresi şeritleri ya da yaprağın yanında küçük bir boyaya duyarlı güneş hücresi (kırmızı-mor renkli cam plaka).</w:t>
-            </w:r>
-          </w:p>
-          <w:p>
-            <w:pPr>
-              <w:jc w:val="both"/>
-              <w:rPr>
-                <w:rFonts w:ascii="Times New Roman" w:hAnsi="Times New Roman" w:cs="Times New Roman"/>
-                <w:lang w:val="tr-TR"/>
-              </w:rPr>
-            </w:pPr>
-            <w:r>
-              <w:rPr>
-                <w:rFonts w:ascii="Times New Roman" w:hAnsi="Times New Roman" w:cs="Times New Roman"/>
-                <w:lang w:val="tr-TR"/>
-              </w:rPr>
-              <w:t xml:space="preserve">Shutterstock arama: “dye sensitized solar cell leaf”</w:t>
-            </w:r>
-          </w:p>
-          <w:p>
-            <w:pPr>
-              <w:jc w:val="both"/>
-              <w:rPr>
-                <w:rFonts w:ascii="Times New Roman" w:hAnsi="Times New Roman" w:cs="Times New Roman"/>
-                <w:lang w:val="tr-TR"/>
-              </w:rPr>
-            </w:pPr>
-            <w:r>
-              <w:rPr>
-                <w:rFonts w:ascii="Times New Roman" w:hAnsi="Times New Roman" w:cs="Times New Roman"/>
-                <w:lang w:val="tr-TR"/>
-              </w:rPr>
-              <w:t xml:space="preserve">Shutter ID: Boyaya duyarlı güneş hücresi fotoğrafı bulunamadı; atölyede yapılan hücrenin fotoğrafı çekilmeli ya da yayınevi çizmeli.</w:t>
-            </w:r>
-          </w:p>
-        </w:tc>
-      </w:tr>
-    </w:tbl>
+      </w:pPr>
+      <w:r>
+        <w:drawing>
+          <wp:inline xmlns:a="http://schemas.openxmlformats.org/drawingml/2006/main" xmlns:pic="http://schemas.openxmlformats.org/drawingml/2006/picture">
+            <wp:extent cx="3960000" cy="2158337"/>
+            <wp:docPr id="900018" name="Picture 900018"/>
+            <wp:cNvGraphicFramePr>
+              <a:graphicFrameLocks noChangeAspect="1"/>
+            </wp:cNvGraphicFramePr>
+            <a:graphic>
+              <a:graphicData uri="http://schemas.openxmlformats.org/drawingml/2006/picture">
+                <pic:pic>
+                  <pic:nvPicPr>
+                    <pic:cNvPr id="0" name="k12_31_yaprak_hucre.png"/>
+                    <pic:cNvPicPr/>
+                  </pic:nvPicPr>
+                  <pic:blipFill>
+                    <a:blip r:embed="rId15"/>
+                    <a:stretch>
+                      <a:fillRect/>
+                    </a:stretch>
+                  </pic:blipFill>
+                  <pic:spPr>
+                    <a:xfrm>
+                      <a:off x="0" y="0"/>
+                      <a:ext cx="3960000" cy="2158337"/>
+                    </a:xfrm>
+                    <a:prstGeom prst="rect"/>
+                  </pic:spPr>
+                </pic:pic>
+              </a:graphicData>
+            </a:graphic>
+          </wp:inline>
+        </w:drawing>
+      </w:r>
+    </w:p>
     <w:p>
       <w:pPr>
         <w:jc w:val="both"/>
@@ -1461,93 +1413,45 @@
         <w:t xml:space="preserve"> Çatıdaki silisyum güneş panelleri</w:t>
       </w:r>
     </w:p>
-    <w:tbl>
-      <w:tblPr>
-        <w:tblW w:w="9000" w:type="dxa"/>
+    <w:p>
+      <w:pPr>
         <w:jc w:val="center"/>
-        <w:tblBorders>
-          <w:top w:val="single" w:sz="8" w:space="0" w:color="7F7F7F"/>
-          <w:left w:val="single" w:sz="8" w:space="0" w:color="7F7F7F"/>
-          <w:bottom w:val="single" w:sz="8" w:space="0" w:color="7F7F7F"/>
-          <w:right w:val="single" w:sz="8" w:space="0" w:color="7F7F7F"/>
-        </w:tblBorders>
-      </w:tblPr>
-      <w:tblGrid>
-        <w:gridCol w:w="9000"/>
-      </w:tblGrid>
-      <w:tr>
-        <w:tc>
-          <w:tcPr>
-            <w:tcW w:w="9000" w:type="dxa"/>
-            <w:shd w:val="clear" w:color="auto" w:fill="EDEDED"/>
-          </w:tcPr>
-          <w:p>
-            <w:pPr>
-              <w:jc w:val="both"/>
-              <w:rPr>
-                <w:rFonts w:ascii="Times New Roman" w:hAnsi="Times New Roman" w:cs="Times New Roman"/>
-                <w:lang w:val="tr-TR"/>
-              </w:rPr>
-            </w:pPr>
-            <w:r>
-              <w:rPr>
-                <w:rFonts w:ascii="Times New Roman" w:hAnsi="Times New Roman" w:cs="Times New Roman"/>
-                <w:lang w:val="tr-TR"/>
-              </w:rPr>
-              <w:t xml:space="preserve">GÖRSEL ALANI</w:t>
-            </w:r>
-          </w:p>
-          <w:p>
-            <w:pPr>
-              <w:jc w:val="both"/>
-              <w:rPr>
-                <w:rFonts w:ascii="Times New Roman" w:hAnsi="Times New Roman" w:cs="Times New Roman"/>
-                <w:lang w:val="tr-TR"/>
-              </w:rPr>
-            </w:pPr>
-            <w:r>
-              <w:rPr>
-                <w:rFonts w:ascii="Times New Roman" w:hAnsi="Times New Roman" w:cs="Times New Roman"/>
-                <w:lang w:val="tr-TR"/>
-              </w:rPr>
-              <w:t xml:space="preserve">Tarif: Kırmızı-turuncu-yeşil tonlarda, yarı saydam boyaya duyarlı güneş hücresi panellerinden oluşan bir cam cephe ya da laboratuvarda tutulan küçük kırmızı-mor renkli hücre (marka görünmesin).</w:t>
-            </w:r>
-          </w:p>
-          <w:p>
-            <w:pPr>
-              <w:jc w:val="both"/>
-              <w:rPr>
-                <w:rFonts w:ascii="Times New Roman" w:hAnsi="Times New Roman" w:cs="Times New Roman"/>
-                <w:lang w:val="tr-TR"/>
-              </w:rPr>
-            </w:pPr>
-            <w:r>
-              <w:rPr>
-                <w:rFonts w:ascii="Times New Roman" w:hAnsi="Times New Roman" w:cs="Times New Roman"/>
-                <w:lang w:val="tr-TR"/>
-              </w:rPr>
-              <w:t xml:space="preserve">Shutterstock arama: “dye sensitized solar cell colorful glass”</w:t>
-            </w:r>
-          </w:p>
-          <w:p>
-            <w:pPr>
-              <w:jc w:val="both"/>
-              <w:rPr>
-                <w:rFonts w:ascii="Times New Roman" w:hAnsi="Times New Roman" w:cs="Times New Roman"/>
-                <w:lang w:val="tr-TR"/>
-              </w:rPr>
-            </w:pPr>
-            <w:r>
-              <w:rPr>
-                <w:rFonts w:ascii="Times New Roman" w:hAnsi="Times New Roman" w:cs="Times New Roman"/>
-                <w:lang w:val="tr-TR"/>
-              </w:rPr>
-              <w:t xml:space="preserve">Shutter ID: Boyaya duyarlı güneş hücresi cephe/hücre fotoğrafı bulunamadı; atölyede yapılan hücrenin fotoğrafı çekilmeli ya da yayınevi çizmeli.</w:t>
-            </w:r>
-          </w:p>
-        </w:tc>
-      </w:tr>
-    </w:tbl>
+      </w:pPr>
+      <w:r>
+        <w:drawing>
+          <wp:inline xmlns:a="http://schemas.openxmlformats.org/drawingml/2006/main" xmlns:pic="http://schemas.openxmlformats.org/drawingml/2006/picture">
+            <wp:extent cx="2628000" cy="2015205"/>
+            <wp:docPr id="900019" name="Picture 900019"/>
+            <wp:cNvGraphicFramePr>
+              <a:graphicFrameLocks noChangeAspect="1"/>
+            </wp:cNvGraphicFramePr>
+            <a:graphic>
+              <a:graphicData uri="http://schemas.openxmlformats.org/drawingml/2006/picture">
+                <pic:pic>
+                  <pic:nvPicPr>
+                    <pic:cNvPr id="0" name="k12_31_renkli_cephe.png"/>
+                    <pic:cNvPicPr/>
+                  </pic:nvPicPr>
+                  <pic:blipFill>
+                    <a:blip r:embed="rId16"/>
+                    <a:stretch>
+                      <a:fillRect/>
+                    </a:stretch>
+                  </pic:blipFill>
+                  <pic:spPr>
+                    <a:xfrm>
+                      <a:off x="0" y="0"/>
+                      <a:ext cx="2628000" cy="2015205"/>
+                    </a:xfrm>
+                    <a:prstGeom prst="rect"/>
+                  </pic:spPr>
+                </pic:pic>
+              </a:graphicData>
+            </a:graphic>
+          </wp:inline>
+        </w:drawing>
+      </w:r>
+    </w:p>
     <w:p>
       <w:pPr>
         <w:jc w:val="both"/>
@@ -1742,93 +1646,45 @@
         <w:t xml:space="preserve">Aşağıdaki görselde okul laboratuvarında hazırlanabilen bir güneş hücresinin katmanları gösterilmiştir. Hücredeki boya maddesi ile yapraktaki klorofil, hücredeki elektrolit çözeltisi ile fotosentezde elektron kaynağı olan su arasında hangi benzerlikleri fark ediyorsunuz?</w:t>
       </w:r>
     </w:p>
-    <w:tbl>
-      <w:tblPr>
-        <w:tblW w:w="9000" w:type="dxa"/>
+    <w:p>
+      <w:pPr>
         <w:jc w:val="center"/>
-        <w:tblBorders>
-          <w:top w:val="single" w:sz="8" w:space="0" w:color="7F7F7F"/>
-          <w:left w:val="single" w:sz="8" w:space="0" w:color="7F7F7F"/>
-          <w:bottom w:val="single" w:sz="8" w:space="0" w:color="7F7F7F"/>
-          <w:right w:val="single" w:sz="8" w:space="0" w:color="7F7F7F"/>
-        </w:tblBorders>
-      </w:tblPr>
-      <w:tblGrid>
-        <w:gridCol w:w="9000"/>
-      </w:tblGrid>
-      <w:tr>
-        <w:tc>
-          <w:tcPr>
-            <w:tcW w:w="9000" w:type="dxa"/>
-            <w:shd w:val="clear" w:color="auto" w:fill="EDEDED"/>
-          </w:tcPr>
-          <w:p>
-            <w:pPr>
-              <w:jc w:val="both"/>
-              <w:rPr>
-                <w:rFonts w:ascii="Times New Roman" w:hAnsi="Times New Roman" w:cs="Times New Roman"/>
-                <w:lang w:val="tr-TR"/>
-              </w:rPr>
-            </w:pPr>
-            <w:r>
-              <w:rPr>
-                <w:rFonts w:ascii="Times New Roman" w:hAnsi="Times New Roman" w:cs="Times New Roman"/>
-                <w:lang w:val="tr-TR"/>
-              </w:rPr>
-              <w:t xml:space="preserve">GÖRSEL ALANI</w:t>
-            </w:r>
-          </w:p>
-          <w:p>
-            <w:pPr>
-              <w:jc w:val="both"/>
-              <w:rPr>
-                <w:rFonts w:ascii="Times New Roman" w:hAnsi="Times New Roman" w:cs="Times New Roman"/>
-                <w:lang w:val="tr-TR"/>
-              </w:rPr>
-            </w:pPr>
-            <w:r>
-              <w:rPr>
-                <w:rFonts w:ascii="Times New Roman" w:hAnsi="Times New Roman" w:cs="Times New Roman"/>
-                <w:lang w:val="tr-TR"/>
-              </w:rPr>
-              <w:t xml:space="preserve">Tarif: Yandan kesit şeması (vektörel, yayınevi çizecek): üstte iletken kaplamalı cam; altında beyaz titanyum dioksit nanoparçacık katmanı ve parçacıkların yüzeyine tutunmuş mor boya molekülleri; ortada iyot/iyodür içeren elektrolit; altta grafit (karbon) kaplı iletken cam (karşı elektrot); iki cam bir dış devre ile küçük bir LED’e bağlı; üstten gelen güneş ışığı okları. Katman adları Türkçe yazılsın.</w:t>
-            </w:r>
-          </w:p>
-          <w:p>
-            <w:pPr>
-              <w:jc w:val="both"/>
-              <w:rPr>
-                <w:rFonts w:ascii="Times New Roman" w:hAnsi="Times New Roman" w:cs="Times New Roman"/>
-                <w:lang w:val="tr-TR"/>
-              </w:rPr>
-            </w:pPr>
-            <w:r>
-              <w:rPr>
-                <w:rFonts w:ascii="Times New Roman" w:hAnsi="Times New Roman" w:cs="Times New Roman"/>
-                <w:lang w:val="tr-TR"/>
-              </w:rPr>
-              <w:t xml:space="preserve">Shutterstock arama: “dye sensitized solar cell structure diagram”</w:t>
-            </w:r>
-          </w:p>
-          <w:p>
-            <w:pPr>
-              <w:jc w:val="both"/>
-              <w:rPr>
-                <w:rFonts w:ascii="Times New Roman" w:hAnsi="Times New Roman" w:cs="Times New Roman"/>
-                <w:lang w:val="tr-TR"/>
-              </w:rPr>
-            </w:pPr>
-            <w:r>
-              <w:rPr>
-                <w:rFonts w:ascii="Times New Roman" w:hAnsi="Times New Roman" w:cs="Times New Roman"/>
-                <w:lang w:val="tr-TR"/>
-              </w:rPr>
-              <w:t xml:space="preserve">Shutter ID: Yok; şema yayınevi tarafından çizilecek.</w:t>
-            </w:r>
-          </w:p>
-        </w:tc>
-      </w:tr>
-    </w:tbl>
+      </w:pPr>
+      <w:r>
+        <w:drawing>
+          <wp:inline xmlns:a="http://schemas.openxmlformats.org/drawingml/2006/main" xmlns:pic="http://schemas.openxmlformats.org/drawingml/2006/picture">
+            <wp:extent cx="5040000" cy="3204501"/>
+            <wp:docPr id="900020" name="Picture 900020"/>
+            <wp:cNvGraphicFramePr>
+              <a:graphicFrameLocks noChangeAspect="1"/>
+            </wp:cNvGraphicFramePr>
+            <a:graphic>
+              <a:graphicData uri="http://schemas.openxmlformats.org/drawingml/2006/picture">
+                <pic:pic>
+                  <pic:nvPicPr>
+                    <pic:cNvPr id="0" name="k12_31_dssc_kesit.png"/>
+                    <pic:cNvPicPr/>
+                  </pic:nvPicPr>
+                  <pic:blipFill>
+                    <a:blip r:embed="rId17"/>
+                    <a:stretch>
+                      <a:fillRect/>
+                    </a:stretch>
+                  </pic:blipFill>
+                  <pic:spPr>
+                    <a:xfrm>
+                      <a:off x="0" y="0"/>
+                      <a:ext cx="5040000" cy="3204501"/>
+                    </a:xfrm>
+                    <a:prstGeom prst="rect"/>
+                  </pic:spPr>
+                </pic:pic>
+              </a:graphicData>
+            </a:graphic>
+          </wp:inline>
+        </w:drawing>
+      </w:r>
+    </w:p>
     <w:p>
       <w:pPr>
         <w:jc w:val="both"/>
@@ -7471,93 +7327,45 @@
         <w:t xml:space="preserve"> denir. Bu hücreler, geliştiricilerinden Michael Grätzel’in adıyla Grätzel hücresi olarak da bilinir. Hücrede gerçekleşen olaylar Görsel E’de gösterilmiştir:</w:t>
       </w:r>
     </w:p>
-    <w:tbl>
-      <w:tblPr>
-        <w:tblW w:w="9000" w:type="dxa"/>
+    <w:p>
+      <w:pPr>
         <w:jc w:val="center"/>
-        <w:tblBorders>
-          <w:top w:val="single" w:sz="8" w:space="0" w:color="7F7F7F"/>
-          <w:left w:val="single" w:sz="8" w:space="0" w:color="7F7F7F"/>
-          <w:bottom w:val="single" w:sz="8" w:space="0" w:color="7F7F7F"/>
-          <w:right w:val="single" w:sz="8" w:space="0" w:color="7F7F7F"/>
-        </w:tblBorders>
-      </w:tblPr>
-      <w:tblGrid>
-        <w:gridCol w:w="9000"/>
-      </w:tblGrid>
-      <w:tr>
-        <w:tc>
-          <w:tcPr>
-            <w:tcW w:w="9000" w:type="dxa"/>
-            <w:shd w:val="clear" w:color="auto" w:fill="EDEDED"/>
-          </w:tcPr>
-          <w:p>
-            <w:pPr>
-              <w:jc w:val="both"/>
-              <w:rPr>
-                <w:rFonts w:ascii="Times New Roman" w:hAnsi="Times New Roman" w:cs="Times New Roman"/>
-                <w:lang w:val="tr-TR"/>
-              </w:rPr>
-            </w:pPr>
-            <w:r>
-              <w:rPr>
-                <w:rFonts w:ascii="Times New Roman" w:hAnsi="Times New Roman" w:cs="Times New Roman"/>
-                <w:lang w:val="tr-TR"/>
-              </w:rPr>
-              <w:t xml:space="preserve">GÖRSEL ALANI</w:t>
-            </w:r>
-          </w:p>
-          <w:p>
-            <w:pPr>
-              <w:jc w:val="both"/>
-              <w:rPr>
-                <w:rFonts w:ascii="Times New Roman" w:hAnsi="Times New Roman" w:cs="Times New Roman"/>
-                <w:lang w:val="tr-TR"/>
-              </w:rPr>
-            </w:pPr>
-            <w:r>
-              <w:rPr>
-                <w:rFonts w:ascii="Times New Roman" w:hAnsi="Times New Roman" w:cs="Times New Roman"/>
-                <w:lang w:val="tr-TR"/>
-              </w:rPr>
-              <w:t xml:space="preserve">Tarif: Şema (vektörel, yayınevi çizecek): Soldan sağa iletken cam | TiO₂ nanoparçacıkları ve yüzeylerinde boya | elektrolit (I⁻ ve I₃⁻) | karşı elektrot. Numaralı oklar: (1) ışık boyaya çarpar ve boya uyarılır; (2) uyarılmış boyadan TiO₂’ye elektron geçer; (3) elektron iletken cam ve dış devre üzerinden LED’i yakarak karşı elektroda ulaşır; (4) karşı elektrotta I₃⁻ iyonları indirgenerek I⁻ oluşur; (5) I⁻ iyonları boyaya elektron vererek boyayı ilk hâline döndürür. Katman ve basamak adları Türkçe yazılsın.</w:t>
-            </w:r>
-          </w:p>
-          <w:p>
-            <w:pPr>
-              <w:jc w:val="both"/>
-              <w:rPr>
-                <w:rFonts w:ascii="Times New Roman" w:hAnsi="Times New Roman" w:cs="Times New Roman"/>
-                <w:lang w:val="tr-TR"/>
-              </w:rPr>
-            </w:pPr>
-            <w:r>
-              <w:rPr>
-                <w:rFonts w:ascii="Times New Roman" w:hAnsi="Times New Roman" w:cs="Times New Roman"/>
-                <w:lang w:val="tr-TR"/>
-              </w:rPr>
-              <w:t xml:space="preserve">Shutterstock arama: “dye sensitized solar cell working principle electron transfer”</w:t>
-            </w:r>
-          </w:p>
-          <w:p>
-            <w:pPr>
-              <w:jc w:val="both"/>
-              <w:rPr>
-                <w:rFonts w:ascii="Times New Roman" w:hAnsi="Times New Roman" w:cs="Times New Roman"/>
-                <w:lang w:val="tr-TR"/>
-              </w:rPr>
-            </w:pPr>
-            <w:r>
-              <w:rPr>
-                <w:rFonts w:ascii="Times New Roman" w:hAnsi="Times New Roman" w:cs="Times New Roman"/>
-                <w:lang w:val="tr-TR"/>
-              </w:rPr>
-              <w:t xml:space="preserve">Shutter ID: Yok; şema yayınevi tarafından çizilecek.</w:t>
-            </w:r>
-          </w:p>
-        </w:tc>
-      </w:tr>
-    </w:tbl>
+      </w:pPr>
+      <w:r>
+        <w:drawing>
+          <wp:inline xmlns:a="http://schemas.openxmlformats.org/drawingml/2006/main" xmlns:pic="http://schemas.openxmlformats.org/drawingml/2006/picture">
+            <wp:extent cx="5400000" cy="3799209"/>
+            <wp:docPr id="900021" name="Picture 900021"/>
+            <wp:cNvGraphicFramePr>
+              <a:graphicFrameLocks noChangeAspect="1"/>
+            </wp:cNvGraphicFramePr>
+            <a:graphic>
+              <a:graphicData uri="http://schemas.openxmlformats.org/drawingml/2006/picture">
+                <pic:pic>
+                  <pic:nvPicPr>
+                    <pic:cNvPr id="0" name="k12_31_dssc_calisma.png"/>
+                    <pic:cNvPicPr/>
+                  </pic:nvPicPr>
+                  <pic:blipFill>
+                    <a:blip r:embed="rId18"/>
+                    <a:stretch>
+                      <a:fillRect/>
+                    </a:stretch>
+                  </pic:blipFill>
+                  <pic:spPr>
+                    <a:xfrm>
+                      <a:off x="0" y="0"/>
+                      <a:ext cx="5400000" cy="3799209"/>
+                    </a:xfrm>
+                    <a:prstGeom prst="rect"/>
+                  </pic:spPr>
+                </pic:pic>
+              </a:graphicData>
+            </a:graphic>
+          </wp:inline>
+        </w:drawing>
+      </w:r>
+    </w:p>
     <w:p>
       <w:pPr>
         <w:jc w:val="both"/>

</xml_diff>